<commit_message>
sync: 同步天工 v1.2 增补（4222b8c）
- upstream/ 快照刷新（commit 4222b8c，新增 docs/45 局域网人工测试指南索引）
- upstream/CHANGELOG.md 追加本次差异
- docs/13 同步记录表追加一行
- 复导出 44 份 docx + 44 份 pdf
</commit_message>
<xml_diff>
--- a/export/docx/docs/33_13_与天工项目同步机制.docx
+++ b/export/docx/docs/33_13_与天工项目同步机制.docx
@@ -1312,6 +1312,134 @@
           </w:p>
         </w:tc>
       </w:tr>
+      <w:tr>
+        <w:tc>
+          <w:tcPr>
+            <w:tcW w:type="dxa" w:w="960"/>
+          </w:tcPr>
+          <w:p>
+            <w:r/>
+            <w:r>
+              <w:rPr>
+                <w:sz w:val="18"/>
+              </w:rPr>
+              <w:t>2026-10-26</w:t>
+            </w:r>
+          </w:p>
+        </w:tc>
+        <w:tc>
+          <w:tcPr>
+            <w:tcW w:type="dxa" w:w="960"/>
+          </w:tcPr>
+          <w:p>
+            <w:r/>
+            <w:r>
+              <w:rPr>
+                <w:sz w:val="18"/>
+              </w:rPr>
+              <w:t>v1.2 增补</w:t>
+            </w:r>
+          </w:p>
+        </w:tc>
+        <w:tc>
+          <w:tcPr>
+            <w:tcW w:type="dxa" w:w="960"/>
+          </w:tcPr>
+          <w:p>
+            <w:r/>
+            <w:r>
+              <w:rPr>
+                <w:sz w:val="18"/>
+              </w:rPr>
+              <w:t>4222b8c</w:t>
+            </w:r>
+          </w:p>
+        </w:tc>
+        <w:tc>
+          <w:tcPr>
+            <w:tcW w:type="dxa" w:w="960"/>
+          </w:tcPr>
+          <w:p>
+            <w:r/>
+            <w:r>
+              <w:rPr>
+                <w:sz w:val="18"/>
+              </w:rPr>
+              <w:t>120 + 13 E2E</w:t>
+            </w:r>
+          </w:p>
+        </w:tc>
+        <w:tc>
+          <w:tcPr>
+            <w:tcW w:type="dxa" w:w="960"/>
+          </w:tcPr>
+          <w:p>
+            <w:r/>
+            <w:r>
+              <w:rPr>
+                <w:sz w:val="18"/>
+              </w:rPr>
+              <w:t>93%</w:t>
+            </w:r>
+          </w:p>
+        </w:tc>
+        <w:tc>
+          <w:tcPr>
+            <w:tcW w:type="dxa" w:w="960"/>
+          </w:tcPr>
+          <w:p>
+            <w:r/>
+            <w:r>
+              <w:rPr>
+                <w:sz w:val="18"/>
+              </w:rPr>
+              <w:t>1 亿 / 5.03 GiB</w:t>
+            </w:r>
+          </w:p>
+        </w:tc>
+        <w:tc>
+          <w:tcPr>
+            <w:tcW w:type="dxa" w:w="960"/>
+          </w:tcPr>
+          <w:p>
+            <w:r/>
+            <w:r>
+              <w:rPr>
+                <w:sz w:val="18"/>
+              </w:rPr>
+              <w:t>0.23 ms</w:t>
+            </w:r>
+          </w:p>
+        </w:tc>
+        <w:tc>
+          <w:tcPr>
+            <w:tcW w:type="dxa" w:w="960"/>
+          </w:tcPr>
+          <w:p>
+            <w:r/>
+            <w:r>
+              <w:rPr>
+                <w:sz w:val="18"/>
+              </w:rPr>
+              <w:t>课程组</w:t>
+            </w:r>
+          </w:p>
+        </w:tc>
+        <w:tc>
+          <w:tcPr>
+            <w:tcW w:type="dxa" w:w="960"/>
+          </w:tcPr>
+          <w:p>
+            <w:r/>
+            <w:r>
+              <w:rPr>
+                <w:sz w:val="18"/>
+              </w:rPr>
+              <w:t>上游新增 docs/45 局域网测试指南；快照自动刷新，课程无数字变化</w:t>
+            </w:r>
+          </w:p>
+        </w:tc>
+      </w:tr>
     </w:tbl>
     <w:p>
       <w:pPr>

</xml_diff>